<commit_message>
docs: actualizar memoria con correcciones de tutora (junio 2026)
</commit_message>
<xml_diff>
--- a/memoria_tfg.docx
+++ b/memoria_tfg.docx
@@ -3810,7 +3810,7 @@
         <w:pStyle w:val="ListParagraph"/>
         <w:numPr>
           <w:ilvl w:val="0"/>
-          <w:numId w:val="3"/>
+          <w:numId w:val="4"/>
         </w:numPr>
         <w:spacing w:after="40" w:before="40"/>
       </w:pPr>
@@ -3828,7 +3828,7 @@
         <w:pStyle w:val="ListParagraph"/>
         <w:numPr>
           <w:ilvl w:val="0"/>
-          <w:numId w:val="3"/>
+          <w:numId w:val="4"/>
         </w:numPr>
         <w:spacing w:after="40" w:before="40"/>
       </w:pPr>
@@ -3846,7 +3846,7 @@
         <w:pStyle w:val="ListParagraph"/>
         <w:numPr>
           <w:ilvl w:val="0"/>
-          <w:numId w:val="3"/>
+          <w:numId w:val="4"/>
         </w:numPr>
         <w:spacing w:after="40" w:before="40"/>
       </w:pPr>
@@ -3864,7 +3864,7 @@
         <w:pStyle w:val="ListParagraph"/>
         <w:numPr>
           <w:ilvl w:val="0"/>
-          <w:numId w:val="3"/>
+          <w:numId w:val="4"/>
         </w:numPr>
         <w:spacing w:after="40" w:before="40"/>
       </w:pPr>
@@ -3882,7 +3882,7 @@
         <w:pStyle w:val="ListParagraph"/>
         <w:numPr>
           <w:ilvl w:val="0"/>
-          <w:numId w:val="3"/>
+          <w:numId w:val="4"/>
         </w:numPr>
         <w:spacing w:after="40" w:before="40"/>
       </w:pPr>
@@ -3917,7 +3917,7 @@
         <w:pStyle w:val="ListParagraph"/>
         <w:numPr>
           <w:ilvl w:val="0"/>
-          <w:numId w:val="3"/>
+          <w:numId w:val="4"/>
         </w:numPr>
         <w:spacing w:after="40" w:before="40"/>
       </w:pPr>
@@ -3935,7 +3935,7 @@
         <w:pStyle w:val="ListParagraph"/>
         <w:numPr>
           <w:ilvl w:val="0"/>
-          <w:numId w:val="3"/>
+          <w:numId w:val="4"/>
         </w:numPr>
         <w:spacing w:after="40" w:before="40"/>
       </w:pPr>
@@ -3953,7 +3953,7 @@
         <w:pStyle w:val="ListParagraph"/>
         <w:numPr>
           <w:ilvl w:val="0"/>
-          <w:numId w:val="3"/>
+          <w:numId w:val="4"/>
         </w:numPr>
         <w:spacing w:after="40" w:before="40"/>
       </w:pPr>
@@ -3971,7 +3971,7 @@
         <w:pStyle w:val="ListParagraph"/>
         <w:numPr>
           <w:ilvl w:val="0"/>
-          <w:numId w:val="3"/>
+          <w:numId w:val="4"/>
         </w:numPr>
         <w:spacing w:after="40" w:before="40"/>
       </w:pPr>
@@ -4006,7 +4006,7 @@
         <w:pStyle w:val="ListParagraph"/>
         <w:numPr>
           <w:ilvl w:val="0"/>
-          <w:numId w:val="3"/>
+          <w:numId w:val="4"/>
         </w:numPr>
         <w:spacing w:after="40" w:before="40"/>
       </w:pPr>
@@ -4024,7 +4024,7 @@
         <w:pStyle w:val="ListParagraph"/>
         <w:numPr>
           <w:ilvl w:val="0"/>
-          <w:numId w:val="3"/>
+          <w:numId w:val="4"/>
         </w:numPr>
         <w:spacing w:after="40" w:before="40"/>
       </w:pPr>
@@ -4042,7 +4042,7 @@
         <w:pStyle w:val="ListParagraph"/>
         <w:numPr>
           <w:ilvl w:val="0"/>
-          <w:numId w:val="3"/>
+          <w:numId w:val="4"/>
         </w:numPr>
         <w:spacing w:after="40" w:before="40"/>
       </w:pPr>
@@ -4060,7 +4060,7 @@
         <w:pStyle w:val="ListParagraph"/>
         <w:numPr>
           <w:ilvl w:val="0"/>
-          <w:numId w:val="3"/>
+          <w:numId w:val="4"/>
         </w:numPr>
         <w:spacing w:after="40" w:before="40"/>
       </w:pPr>
@@ -4078,7 +4078,7 @@
         <w:pStyle w:val="ListParagraph"/>
         <w:numPr>
           <w:ilvl w:val="0"/>
-          <w:numId w:val="3"/>
+          <w:numId w:val="4"/>
         </w:numPr>
         <w:spacing w:after="40" w:before="40"/>
       </w:pPr>
@@ -4096,7 +4096,7 @@
         <w:pStyle w:val="ListParagraph"/>
         <w:numPr>
           <w:ilvl w:val="0"/>
-          <w:numId w:val="3"/>
+          <w:numId w:val="4"/>
         </w:numPr>
         <w:spacing w:after="40" w:before="40"/>
       </w:pPr>
@@ -4114,7 +4114,7 @@
         <w:pStyle w:val="ListParagraph"/>
         <w:numPr>
           <w:ilvl w:val="0"/>
-          <w:numId w:val="3"/>
+          <w:numId w:val="4"/>
         </w:numPr>
         <w:spacing w:after="40" w:before="40"/>
       </w:pPr>
@@ -4132,7 +4132,7 @@
         <w:pStyle w:val="ListParagraph"/>
         <w:numPr>
           <w:ilvl w:val="0"/>
-          <w:numId w:val="3"/>
+          <w:numId w:val="4"/>
         </w:numPr>
         <w:spacing w:after="40" w:before="40"/>
       </w:pPr>
@@ -4167,7 +4167,7 @@
         <w:pStyle w:val="ListParagraph"/>
         <w:numPr>
           <w:ilvl w:val="0"/>
-          <w:numId w:val="3"/>
+          <w:numId w:val="4"/>
         </w:numPr>
         <w:spacing w:after="40" w:before="40"/>
       </w:pPr>
@@ -4185,7 +4185,7 @@
         <w:pStyle w:val="ListParagraph"/>
         <w:numPr>
           <w:ilvl w:val="0"/>
-          <w:numId w:val="3"/>
+          <w:numId w:val="4"/>
         </w:numPr>
         <w:spacing w:after="40" w:before="40"/>
       </w:pPr>
@@ -4203,7 +4203,7 @@
         <w:pStyle w:val="ListParagraph"/>
         <w:numPr>
           <w:ilvl w:val="0"/>
-          <w:numId w:val="3"/>
+          <w:numId w:val="4"/>
         </w:numPr>
         <w:spacing w:after="40" w:before="40"/>
       </w:pPr>
@@ -4221,7 +4221,7 @@
         <w:pStyle w:val="ListParagraph"/>
         <w:numPr>
           <w:ilvl w:val="0"/>
-          <w:numId w:val="3"/>
+          <w:numId w:val="4"/>
         </w:numPr>
         <w:spacing w:after="40" w:before="40"/>
       </w:pPr>
@@ -4239,7 +4239,7 @@
         <w:pStyle w:val="ListParagraph"/>
         <w:numPr>
           <w:ilvl w:val="0"/>
-          <w:numId w:val="3"/>
+          <w:numId w:val="4"/>
         </w:numPr>
         <w:spacing w:after="40" w:before="40"/>
       </w:pPr>
@@ -4274,7 +4274,7 @@
         <w:pStyle w:val="ListParagraph"/>
         <w:numPr>
           <w:ilvl w:val="0"/>
-          <w:numId w:val="3"/>
+          <w:numId w:val="4"/>
         </w:numPr>
         <w:spacing w:after="40" w:before="40"/>
       </w:pPr>
@@ -4292,7 +4292,7 @@
         <w:pStyle w:val="ListParagraph"/>
         <w:numPr>
           <w:ilvl w:val="0"/>
-          <w:numId w:val="3"/>
+          <w:numId w:val="4"/>
         </w:numPr>
         <w:spacing w:after="40" w:before="40"/>
       </w:pPr>
@@ -4310,7 +4310,7 @@
         <w:pStyle w:val="ListParagraph"/>
         <w:numPr>
           <w:ilvl w:val="0"/>
-          <w:numId w:val="3"/>
+          <w:numId w:val="4"/>
         </w:numPr>
         <w:spacing w:after="40" w:before="40"/>
       </w:pPr>
@@ -4328,7 +4328,7 @@
         <w:pStyle w:val="ListParagraph"/>
         <w:numPr>
           <w:ilvl w:val="0"/>
-          <w:numId w:val="3"/>
+          <w:numId w:val="4"/>
         </w:numPr>
         <w:spacing w:after="40" w:before="40"/>
       </w:pPr>
@@ -4346,7 +4346,7 @@
         <w:pStyle w:val="ListParagraph"/>
         <w:numPr>
           <w:ilvl w:val="0"/>
-          <w:numId w:val="3"/>
+          <w:numId w:val="4"/>
         </w:numPr>
         <w:spacing w:after="40" w:before="40"/>
       </w:pPr>
@@ -4364,7 +4364,7 @@
         <w:pStyle w:val="ListParagraph"/>
         <w:numPr>
           <w:ilvl w:val="0"/>
-          <w:numId w:val="3"/>
+          <w:numId w:val="4"/>
         </w:numPr>
         <w:spacing w:after="40" w:before="40"/>
       </w:pPr>
@@ -4987,7 +4987,7 @@
           <w:sz w:val="22"/>
           <w:szCs w:val="22"/>
         </w:rPr>
-        <w:t xml:space="preserve">Aunque no se ha empleado ninguna herramienta de gestión de proyectos formal (como Jira o Trello), se ha mantenido un control de versiones con Git durante el desarrollo, con commits frecuentes que documentan el progreso. Las reuniones de seguimiento con el tutor han servido como punto de revisión al final de cada sprint.</w:t>
+        <w:t xml:space="preserve">Aunque no se ha empleado ninguna herramienta de gestión de proyectos formal (como Jira o Trello), se ha mantenido un control de versiones con Git durante el desarrollo, con commits frecuentes que documentan el progreso.</w:t>
       </w:r>
     </w:p>
     <w:p>
@@ -8594,7 +8594,7 @@
         <w:pStyle w:val="ListParagraph"/>
         <w:numPr>
           <w:ilvl w:val="0"/>
-          <w:numId w:val="3"/>
+          <w:numId w:val="5"/>
         </w:numPr>
         <w:spacing w:after="40" w:before="40"/>
       </w:pPr>
@@ -8612,7 +8612,7 @@
         <w:pStyle w:val="ListParagraph"/>
         <w:numPr>
           <w:ilvl w:val="0"/>
-          <w:numId w:val="3"/>
+          <w:numId w:val="5"/>
         </w:numPr>
         <w:spacing w:after="40" w:before="40"/>
       </w:pPr>
@@ -8630,7 +8630,7 @@
         <w:pStyle w:val="ListParagraph"/>
         <w:numPr>
           <w:ilvl w:val="0"/>
-          <w:numId w:val="3"/>
+          <w:numId w:val="5"/>
         </w:numPr>
         <w:spacing w:after="40" w:before="40"/>
       </w:pPr>
@@ -8648,7 +8648,7 @@
         <w:pStyle w:val="ListParagraph"/>
         <w:numPr>
           <w:ilvl w:val="0"/>
-          <w:numId w:val="3"/>
+          <w:numId w:val="5"/>
         </w:numPr>
         <w:spacing w:after="40" w:before="40"/>
       </w:pPr>
@@ -8666,7 +8666,7 @@
         <w:pStyle w:val="ListParagraph"/>
         <w:numPr>
           <w:ilvl w:val="0"/>
-          <w:numId w:val="3"/>
+          <w:numId w:val="5"/>
         </w:numPr>
         <w:spacing w:after="40" w:before="40"/>
       </w:pPr>
@@ -8684,7 +8684,7 @@
         <w:pStyle w:val="ListParagraph"/>
         <w:numPr>
           <w:ilvl w:val="0"/>
-          <w:numId w:val="3"/>
+          <w:numId w:val="5"/>
         </w:numPr>
         <w:spacing w:after="40" w:before="40"/>
       </w:pPr>
@@ -8702,7 +8702,7 @@
         <w:pStyle w:val="ListParagraph"/>
         <w:numPr>
           <w:ilvl w:val="0"/>
-          <w:numId w:val="3"/>
+          <w:numId w:val="5"/>
         </w:numPr>
         <w:spacing w:after="40" w:before="40"/>
       </w:pPr>
@@ -8720,7 +8720,7 @@
         <w:pStyle w:val="ListParagraph"/>
         <w:numPr>
           <w:ilvl w:val="0"/>
-          <w:numId w:val="3"/>
+          <w:numId w:val="5"/>
         </w:numPr>
         <w:spacing w:after="40" w:before="40"/>
       </w:pPr>
@@ -8738,7 +8738,7 @@
         <w:pStyle w:val="ListParagraph"/>
         <w:numPr>
           <w:ilvl w:val="0"/>
-          <w:numId w:val="3"/>
+          <w:numId w:val="5"/>
         </w:numPr>
         <w:spacing w:after="40" w:before="40"/>
       </w:pPr>
@@ -12464,7 +12464,7 @@
           <w:sz w:val="18"/>
           <w:szCs w:val="18"/>
         </w:rPr>
-        <w:t xml:space="preserve">FOOTBALL_API_KEY=86ab948bf9f04b20959a2be92a3254e9</w:t>
+        <w:t xml:space="preserve">FOOTBALL_API_KEY=TU_API_KEY_AQUI</w:t>
       </w:r>
     </w:p>
     <w:p>
@@ -17788,7 +17788,7 @@
         <w:pStyle w:val="ListParagraph"/>
         <w:numPr>
           <w:ilvl w:val="0"/>
-          <w:numId w:val="3"/>
+          <w:numId w:val="6"/>
         </w:numPr>
         <w:spacing w:after="40" w:before="40"/>
       </w:pPr>
@@ -17806,7 +17806,7 @@
         <w:pStyle w:val="ListParagraph"/>
         <w:numPr>
           <w:ilvl w:val="0"/>
-          <w:numId w:val="3"/>
+          <w:numId w:val="6"/>
         </w:numPr>
         <w:spacing w:after="40" w:before="40"/>
       </w:pPr>
@@ -17824,7 +17824,7 @@
         <w:pStyle w:val="ListParagraph"/>
         <w:numPr>
           <w:ilvl w:val="0"/>
-          <w:numId w:val="3"/>
+          <w:numId w:val="6"/>
         </w:numPr>
         <w:spacing w:after="40" w:before="40"/>
       </w:pPr>
@@ -17842,7 +17842,7 @@
         <w:pStyle w:val="ListParagraph"/>
         <w:numPr>
           <w:ilvl w:val="0"/>
-          <w:numId w:val="3"/>
+          <w:numId w:val="6"/>
         </w:numPr>
         <w:spacing w:after="40" w:before="40"/>
       </w:pPr>
@@ -17860,7 +17860,7 @@
         <w:pStyle w:val="ListParagraph"/>
         <w:numPr>
           <w:ilvl w:val="0"/>
-          <w:numId w:val="3"/>
+          <w:numId w:val="6"/>
         </w:numPr>
         <w:spacing w:after="40" w:before="40"/>
       </w:pPr>
@@ -17878,7 +17878,7 @@
         <w:pStyle w:val="ListParagraph"/>
         <w:numPr>
           <w:ilvl w:val="0"/>
-          <w:numId w:val="3"/>
+          <w:numId w:val="6"/>
         </w:numPr>
         <w:spacing w:after="40" w:before="40"/>
       </w:pPr>
@@ -17896,7 +17896,7 @@
         <w:pStyle w:val="ListParagraph"/>
         <w:numPr>
           <w:ilvl w:val="0"/>
-          <w:numId w:val="3"/>
+          <w:numId w:val="6"/>
         </w:numPr>
         <w:spacing w:after="40" w:before="40"/>
       </w:pPr>
@@ -17914,7 +17914,7 @@
         <w:pStyle w:val="ListParagraph"/>
         <w:numPr>
           <w:ilvl w:val="0"/>
-          <w:numId w:val="3"/>
+          <w:numId w:val="6"/>
         </w:numPr>
         <w:spacing w:after="40" w:before="40"/>
       </w:pPr>
@@ -17980,7 +17980,7 @@
         <w:pStyle w:val="ListParagraph"/>
         <w:numPr>
           <w:ilvl w:val="0"/>
-          <w:numId w:val="3"/>
+          <w:numId w:val="7"/>
         </w:numPr>
         <w:spacing w:after="40" w:before="40"/>
       </w:pPr>
@@ -17998,7 +17998,7 @@
         <w:pStyle w:val="ListParagraph"/>
         <w:numPr>
           <w:ilvl w:val="0"/>
-          <w:numId w:val="3"/>
+          <w:numId w:val="7"/>
         </w:numPr>
         <w:spacing w:after="40" w:before="40"/>
       </w:pPr>
@@ -18238,7 +18238,7 @@
         <w:pStyle w:val="ListParagraph"/>
         <w:numPr>
           <w:ilvl w:val="0"/>
-          <w:numId w:val="3"/>
+          <w:numId w:val="8"/>
         </w:numPr>
         <w:spacing w:after="40" w:before="40"/>
       </w:pPr>
@@ -18256,7 +18256,7 @@
         <w:pStyle w:val="ListParagraph"/>
         <w:numPr>
           <w:ilvl w:val="0"/>
-          <w:numId w:val="3"/>
+          <w:numId w:val="8"/>
         </w:numPr>
         <w:spacing w:after="40" w:before="40"/>
       </w:pPr>
@@ -18274,7 +18274,7 @@
         <w:pStyle w:val="ListParagraph"/>
         <w:numPr>
           <w:ilvl w:val="0"/>
-          <w:numId w:val="3"/>
+          <w:numId w:val="8"/>
         </w:numPr>
         <w:spacing w:after="40" w:before="40"/>
       </w:pPr>
@@ -18292,7 +18292,7 @@
         <w:pStyle w:val="ListParagraph"/>
         <w:numPr>
           <w:ilvl w:val="0"/>
-          <w:numId w:val="3"/>
+          <w:numId w:val="8"/>
         </w:numPr>
         <w:spacing w:after="40" w:before="40"/>
       </w:pPr>
@@ -18310,7 +18310,7 @@
         <w:pStyle w:val="ListParagraph"/>
         <w:numPr>
           <w:ilvl w:val="0"/>
-          <w:numId w:val="3"/>
+          <w:numId w:val="8"/>
         </w:numPr>
         <w:spacing w:after="40" w:before="40"/>
       </w:pPr>
@@ -18328,7 +18328,7 @@
         <w:pStyle w:val="ListParagraph"/>
         <w:numPr>
           <w:ilvl w:val="0"/>
-          <w:numId w:val="3"/>
+          <w:numId w:val="8"/>
         </w:numPr>
         <w:spacing w:after="40" w:before="40"/>
       </w:pPr>
@@ -28702,7 +28702,7 @@
           <w:sz w:val="20"/>
           <w:szCs w:val="20"/>
         </w:rPr>
-        <w:t xml:space="preserve">— Fin del documento —</w:t>
+        <w:t xml:space="preserve"/>
       </w:r>
     </w:p>
     <w:sectPr>
@@ -29357,6 +29357,36 @@
       <w:startOverride w:val="1"/>
     </w:lvlOverride>
   </w:num>
+  <w:num w:numId="4">
+    <w:abstractNumId w:val="3"/>
+    <w:lvlOverride w:ilvl="0">
+      <w:startOverride w:val="1"/>
+    </w:lvlOverride>
+  </w:num>
+  <w:num w:numId="5">
+    <w:abstractNumId w:val="3"/>
+    <w:lvlOverride w:ilvl="0">
+      <w:startOverride w:val="1"/>
+    </w:lvlOverride>
+  </w:num>
+  <w:num w:numId="6">
+    <w:abstractNumId w:val="3"/>
+    <w:lvlOverride w:ilvl="0">
+      <w:startOverride w:val="1"/>
+    </w:lvlOverride>
+  </w:num>
+  <w:num w:numId="7">
+    <w:abstractNumId w:val="3"/>
+    <w:lvlOverride w:ilvl="0">
+      <w:startOverride w:val="1"/>
+    </w:lvlOverride>
+  </w:num>
+  <w:num w:numId="8">
+    <w:abstractNumId w:val="3"/>
+    <w:lvlOverride w:ilvl="0">
+      <w:startOverride w:val="1"/>
+    </w:lvlOverride>
+  </w:num>
 </w:numbering>
 </file>
 

</xml_diff>